<commit_message>
[py] Select, copy, delete, paste cells in a flow
Use Ctr-Click and Shift-Click to select cells. Delete, Ctrl-X, Ctrl-C to delete/cut/copy cell. Paste copied cells into any Str cell to insert them at the cursor there.
</commit_message>
<xml_diff>
--- a/Joakim_Pettersson_CV_Additude_M4_2025-11-11.docx
+++ b/Joakim_Pettersson_CV_Additude_M4_2025-11-11.docx
@@ -24,16 +24,14 @@
         <w:rPr>
           <w:sz w:val="22"/>
         </w:rPr>
-        <w:t xml:space="preserve">Senior Embedded &amp; Control Systems Engineer – Automotive, Energy &amp; </w:t>
-      </w:r>
-      <w:proofErr w:type="spellStart"/>
+        <w:t>Senior Embedded &amp; Control Systems Engineer – Automotive, Energy</w:t>
+      </w:r>
       <w:r>
         <w:rPr>
           <w:sz w:val="22"/>
         </w:rPr>
-        <w:t>eMobility</w:t>
-      </w:r>
-      <w:proofErr w:type="spellEnd"/>
+        <w:t>, Housing</w:t>
+      </w:r>
     </w:p>
     <w:p>
       <w:pPr>

</xml_diff>